<commit_message>
feature - add Local Sidereal Time to top coordnates bar for Telescope and 3D views, wap LHA and LST with double click, Added language file translations and updatd manual. Bump version to 1.2.2.8
</commit_message>
<xml_diff>
--- a/Resources/Manuals/GSS Manual.docx
+++ b/Resources/Manuals/GSS Manual.docx
@@ -5599,6 +5599,9 @@
       <w:r>
         <w:t xml:space="preserve"> the distance of a point east of the First Point of Aries, measured along the celestial equator and expressed in hours, minutes, and seconds.</w:t>
       </w:r>
+      <w:r>
+        <w:t xml:space="preserve"> Double click on the value to swap between hours and degrees display.</w:t>
+      </w:r>
     </w:p>
     <w:p>
       <w:bookmarkStart w:id="30" w:name="_Toc62017068"/>
@@ -5672,6 +5675,57 @@
       <w:r>
         <w:t xml:space="preserve"> – it is the angle between the meridian of the observer and the meridian of the object you are pointing at.  This can be used to tell how far the object is before or after the meridian.</w:t>
       </w:r>
+      <w:r>
+        <w:t xml:space="preserve"> </w:t>
+      </w:r>
+      <w:r>
+        <w:t>Double click on the value to swap between</w:t>
+      </w:r>
+      <w:r>
+        <w:t xml:space="preserve"> Local Hour Angle and Local Sidereal Time</w:t>
+      </w:r>
+      <w:r>
+        <w:t>.</w:t>
+      </w:r>
+      <w:r>
+        <w:t xml:space="preserve"> </w:t>
+      </w:r>
+      <w:r>
+        <w:t xml:space="preserve">Local </w:t>
+      </w:r>
+      <w:r>
+        <w:t>S</w:t>
+      </w:r>
+      <w:r>
+        <w:t xml:space="preserve">idereal </w:t>
+      </w:r>
+      <w:r>
+        <w:t>T</w:t>
+      </w:r>
+      <w:r>
+        <w:t xml:space="preserve">ime </w:t>
+      </w:r>
+      <w:r>
+        <w:t>equals the</w:t>
+      </w:r>
+      <w:r>
+        <w:t xml:space="preserve"> Right Ascension (R.A.) of the celestial coordinate </w:t>
+      </w:r>
+      <w:r>
+        <w:t xml:space="preserve">of an object </w:t>
+      </w:r>
+      <w:r>
+        <w:t xml:space="preserve">that is currently crossing </w:t>
+      </w:r>
+      <w:r>
+        <w:t>the</w:t>
+      </w:r>
+      <w:r>
+        <w:t xml:space="preserve"> local meridian</w:t>
+      </w:r>
+      <w:r>
+        <w:t>.</w:t>
+      </w:r>
     </w:p>
     <w:p>
       <w:bookmarkStart w:id="34" w:name="_Toc62017072"/>
@@ -5751,6 +5805,7 @@
         <w:rPr>
           <w:rStyle w:val="Heading3Char"/>
         </w:rPr>
+        <w:lastRenderedPageBreak/>
         <w:t>Import Button</w:t>
       </w:r>
       <w:bookmarkEnd w:id="38"/>
@@ -5767,7 +5822,6 @@
         <w:rPr>
           <w:rStyle w:val="Heading2Char"/>
         </w:rPr>
-        <w:lastRenderedPageBreak/>
         <w:t xml:space="preserve">Backlash Compensate </w:t>
       </w:r>
     </w:p>
@@ -6045,7 +6099,11 @@
         <w:t xml:space="preserve">. </w:t>
       </w:r>
       <w:r>
-        <w:t xml:space="preserve">For Alt/Az mounts the home position is defined as Az pointing to North and the telescope tube horizontal.  </w:t>
+        <w:t xml:space="preserve">For Alt/Az mounts the home </w:t>
+      </w:r>
+      <w:r>
+        <w:lastRenderedPageBreak/>
+        <w:t xml:space="preserve">position is defined as Az pointing to North and the telescope tube horizontal.  </w:t>
       </w:r>
       <w:r>
         <w:t xml:space="preserve">For polar mounts the home position is defined as Az pointing South (North for the southern hemisphere) and the telescope tube 5 degrees above horizontal. </w:t>
@@ -6075,283 +6133,286 @@
         <w:rPr>
           <w:rStyle w:val="Heading3Char"/>
         </w:rPr>
+        <w:t>Stop Button</w:t>
+      </w:r>
+      <w:bookmarkEnd w:id="46"/>
+      <w:r>
+        <w:t>– Stops mount movement</w:t>
+      </w:r>
+    </w:p>
+    <w:p>
+      <w:bookmarkStart w:id="47" w:name="_Toc62017085"/>
+      <w:r>
+        <w:rPr>
+          <w:rStyle w:val="Heading3Char"/>
+        </w:rPr>
+        <w:t>Tracking</w:t>
+      </w:r>
+      <w:bookmarkEnd w:id="47"/>
+      <w:r>
+        <w:t xml:space="preserve"> </w:t>
+      </w:r>
+      <w:r>
+        <w:rPr>
+          <w:rStyle w:val="Heading3Char"/>
+        </w:rPr>
+        <w:t>Button</w:t>
+      </w:r>
+      <w:r>
+        <w:t xml:space="preserve"> </w:t>
+      </w:r>
+      <w:r>
+        <w:t>–</w:t>
+      </w:r>
+      <w:r>
+        <w:t xml:space="preserve"> turn on or off the selected tracking rate to use.  Will be automatically applied after a slew or goto.</w:t>
+      </w:r>
+      <w:r>
+        <w:t xml:space="preserve"> For Alt/Az mounts tracking will maintain a constant Right Ascension and Declination so that an object of interest remains in the center of the field of view. However, without a field </w:t>
+      </w:r>
+      <w:r>
+        <w:t>de-</w:t>
+      </w:r>
+      <w:r>
+        <w:t>rotator the field of view will appear to rotate about the center point. This rotation may be acceptable for visual observation or short</w:t>
+      </w:r>
+      <w:r>
+        <w:t>er</w:t>
+      </w:r>
+      <w:r>
+        <w:t xml:space="preserve"> exposure imaging but star trails will be visible on long</w:t>
+      </w:r>
+      <w:r>
+        <w:t>er</w:t>
+      </w:r>
+      <w:r>
+        <w:t xml:space="preserve"> exposure imaging.</w:t>
+      </w:r>
+    </w:p>
+    <w:p>
+      <w:r>
+        <w:rPr>
+          <w:rStyle w:val="Heading3Char"/>
+        </w:rPr>
+        <w:t>ReSync</w:t>
+      </w:r>
+      <w:r>
+        <w:t xml:space="preserve">– Resets the </w:t>
+      </w:r>
+      <w:r>
+        <w:t xml:space="preserve">mount </w:t>
+      </w:r>
+      <w:r>
+        <w:t xml:space="preserve">axes </w:t>
+      </w:r>
+      <w:r>
+        <w:t xml:space="preserve">encoder </w:t>
+      </w:r>
+      <w:r>
+        <w:t xml:space="preserve">positions to </w:t>
+      </w:r>
+      <w:r>
+        <w:t>either the</w:t>
+      </w:r>
+      <w:r>
+        <w:t xml:space="preserve"> home position</w:t>
+      </w:r>
+      <w:r>
+        <w:t xml:space="preserve"> or a preset park position.</w:t>
+      </w:r>
+      <w:r>
+        <w:t xml:space="preserve"> </w:t>
+      </w:r>
+      <w:r>
+        <w:t>The home position</w:t>
+      </w:r>
+      <w:r>
+        <w:t xml:space="preserve"> for </w:t>
+      </w:r>
+      <w:r>
+        <w:t>equatorial</w:t>
+      </w:r>
+      <w:r>
+        <w:t xml:space="preserve"> mounts</w:t>
+      </w:r>
+      <w:r>
+        <w:t xml:space="preserve"> is defined as </w:t>
+      </w:r>
+      <w:r>
+        <w:t>Dec is</w:t>
+      </w:r>
+      <w:r>
+        <w:t xml:space="preserve"> pointing to the pole and </w:t>
+      </w:r>
+      <w:r>
+        <w:t>R</w:t>
+      </w:r>
+      <w:r>
+        <w:t xml:space="preserve">a with </w:t>
+      </w:r>
+      <w:r>
+        <w:t xml:space="preserve">the </w:t>
+      </w:r>
+      <w:r>
+        <w:t>counterweights</w:t>
+      </w:r>
+      <w:r>
+        <w:t xml:space="preserve"> down.</w:t>
+      </w:r>
+      <w:r>
+        <w:t xml:space="preserve"> </w:t>
+      </w:r>
+      <w:r>
+        <w:t xml:space="preserve">For polar mounts the home position is defined as Az pointing South (North for the southern hemisphere) and the telescope tube 5 degrees above horizontal. </w:t>
+      </w:r>
+      <w:r>
+        <w:t>For Alt/Az mounts the home position is defined as Az pointing to North and the telescope tube horizontal</w:t>
+      </w:r>
+      <w:r>
+        <w:t>.</w:t>
+      </w:r>
+    </w:p>
+    <w:p>
+      <w:r>
+        <w:t>When resyncing with a park position make sure the mount is turned on, connected, and in the desired park position.  If not</w:t>
+      </w:r>
+      <w:r>
+        <w:t xml:space="preserve"> in the correct position</w:t>
+      </w:r>
+      <w:r>
+        <w:t xml:space="preserve">, manually move the mount to the desired position and ReSync with that </w:t>
+      </w:r>
+      <w:r>
+        <w:t xml:space="preserve">park </w:t>
+      </w:r>
+      <w:r>
+        <w:t xml:space="preserve">position.  For encoder accuracy be sure the </w:t>
+      </w:r>
+      <w:r>
+        <w:t xml:space="preserve">manual </w:t>
+      </w:r>
+      <w:r>
+        <w:t>position is as close to the park position as possible.</w:t>
+      </w:r>
+    </w:p>
+    <w:p>
+      <w:bookmarkStart w:id="48" w:name="_Toc62017087"/>
+      <w:r>
+        <w:rPr>
+          <w:rStyle w:val="Heading3Char"/>
+        </w:rPr>
+        <w:t>Flip SOP Button</w:t>
+      </w:r>
+      <w:bookmarkEnd w:id="48"/>
+      <w:r>
+        <w:rPr>
+          <w:rStyle w:val="Heading3Char"/>
+        </w:rPr>
+        <w:t xml:space="preserve"> </w:t>
+      </w:r>
+      <w:r>
+        <w:t xml:space="preserve">– </w:t>
+      </w:r>
+      <w:r>
+        <w:t xml:space="preserve">for equatorial mounts </w:t>
+      </w:r>
+      <w:r>
+        <w:t>moves the mount to the opposite side of the pier</w:t>
+      </w:r>
+      <w:r>
+        <w:t xml:space="preserve"> if allowed by hardware limits</w:t>
+      </w:r>
+      <w:r>
+        <w:t xml:space="preserve">. </w:t>
+      </w:r>
+      <w:r>
+        <w:t>Works in both directions.</w:t>
+      </w:r>
+      <w:r>
+        <w:t xml:space="preserve"> The button text is color accented when flip is allowed.</w:t>
+      </w:r>
+      <w:r>
+        <w:t xml:space="preserve"> </w:t>
+      </w:r>
+      <w:r>
+        <w:t>An “On” badge is active when a flip is in progress.</w:t>
+      </w:r>
+    </w:p>
+    <w:p>
+      <w:bookmarkStart w:id="49" w:name="_Toc62017088"/>
+      <w:r>
+        <w:t xml:space="preserve">For Alt/Az mounts </w:t>
+      </w:r>
+      <w:r>
+        <w:t>moves the mount in the opposite direction to positions around the South azimuth direction</w:t>
+      </w:r>
+      <w:r>
+        <w:t xml:space="preserve"> pier if allowed by hardware limits.</w:t>
+      </w:r>
+      <w:r>
+        <w:t xml:space="preserve"> Works in both directions. </w:t>
+      </w:r>
+      <w:r>
+        <w:rPr>
+          <w:color w:val="FF0000"/>
+        </w:rPr>
+        <w:t>WARNING: The mount will slew 360 degrees through North to reach the new position. Check that cables will not twist or bind.</w:t>
+      </w:r>
+      <w:r>
+        <w:t xml:space="preserve">  </w:t>
+      </w:r>
+    </w:p>
+    <w:p>
+      <w:r>
+        <w:t>For polar mounts moves the mount to the alternative R</w:t>
+      </w:r>
+      <w:r>
+        <w:t>A</w:t>
+      </w:r>
+      <w:r>
+        <w:t>/Dec position if allowed by hardware limits.</w:t>
+      </w:r>
+    </w:p>
+    <w:p>
+      <w:pPr>
+        <w:rPr>
+          <w:color w:val="FF0000"/>
+        </w:rPr>
+      </w:pPr>
+      <w:r>
+        <w:rPr>
+          <w:rStyle w:val="Heading3Char"/>
+        </w:rPr>
+        <w:t>AutoHome Button</w:t>
+      </w:r>
+      <w:bookmarkEnd w:id="49"/>
+      <w:r>
+        <w:rPr>
+          <w:rStyle w:val="Heading3Char"/>
+        </w:rPr>
+        <w:t xml:space="preserve"> </w:t>
+      </w:r>
+      <w:r>
+        <w:t xml:space="preserve">– If your mount is equipped with auto home sensors then this button will assist in recovering the mount </w:t>
+      </w:r>
+      <w:r>
+        <w:t xml:space="preserve">when it </w:t>
+      </w:r>
+      <w:r>
+        <w:t>start</w:t>
+      </w:r>
+      <w:r>
+        <w:t>s</w:t>
+      </w:r>
+      <w:r>
+        <w:t xml:space="preserve"> in a position that is not recognized as a park or home position.  </w:t>
+      </w:r>
+      <w:r>
+        <w:t xml:space="preserve">This would be helpful if the mount loses power and is then </w:t>
+      </w:r>
+      <w:r>
         <w:lastRenderedPageBreak/>
-        <w:t>Stop Button</w:t>
-      </w:r>
-      <w:bookmarkEnd w:id="46"/>
-      <w:r>
-        <w:t>– Stops mount movement</w:t>
-      </w:r>
-    </w:p>
-    <w:p>
-      <w:bookmarkStart w:id="47" w:name="_Toc62017085"/>
-      <w:r>
-        <w:rPr>
-          <w:rStyle w:val="Heading3Char"/>
-        </w:rPr>
-        <w:t>Tracking</w:t>
-      </w:r>
-      <w:bookmarkEnd w:id="47"/>
-      <w:r>
-        <w:t xml:space="preserve"> </w:t>
-      </w:r>
-      <w:r>
-        <w:rPr>
-          <w:rStyle w:val="Heading3Char"/>
-        </w:rPr>
-        <w:t>Button</w:t>
-      </w:r>
-      <w:r>
-        <w:t xml:space="preserve"> </w:t>
-      </w:r>
-      <w:r>
-        <w:t>–</w:t>
-      </w:r>
-      <w:r>
-        <w:t xml:space="preserve"> turn on or off the selected tracking rate to use.  Will be automatically applied after a slew or goto.</w:t>
-      </w:r>
-      <w:r>
-        <w:t xml:space="preserve"> For Alt/Az mounts tracking will maintain a constant Right Ascension and Declination so that an object of interest remains in the center of the field of view. However, without a field </w:t>
-      </w:r>
-      <w:r>
-        <w:t>de-</w:t>
-      </w:r>
-      <w:r>
-        <w:t>rotator the field of view will appear to rotate about the center point. This rotation may be acceptable for visual observation or short</w:t>
-      </w:r>
-      <w:r>
-        <w:t>er</w:t>
-      </w:r>
-      <w:r>
-        <w:t xml:space="preserve"> exposure imaging but star trails will be visible on long</w:t>
-      </w:r>
-      <w:r>
-        <w:t>er</w:t>
-      </w:r>
-      <w:r>
-        <w:t xml:space="preserve"> exposure imaging.</w:t>
-      </w:r>
-    </w:p>
-    <w:p>
-      <w:r>
-        <w:rPr>
-          <w:rStyle w:val="Heading3Char"/>
-        </w:rPr>
-        <w:t>ReSync</w:t>
-      </w:r>
-      <w:r>
-        <w:t xml:space="preserve">– Resets the </w:t>
-      </w:r>
-      <w:r>
-        <w:t xml:space="preserve">mount </w:t>
-      </w:r>
-      <w:r>
-        <w:t xml:space="preserve">axes </w:t>
-      </w:r>
-      <w:r>
-        <w:t xml:space="preserve">encoder </w:t>
-      </w:r>
-      <w:r>
-        <w:t xml:space="preserve">positions to </w:t>
-      </w:r>
-      <w:r>
-        <w:t>either the</w:t>
-      </w:r>
-      <w:r>
-        <w:t xml:space="preserve"> home position</w:t>
-      </w:r>
-      <w:r>
-        <w:t xml:space="preserve"> or a preset park position.</w:t>
-      </w:r>
-      <w:r>
-        <w:t xml:space="preserve"> </w:t>
-      </w:r>
-      <w:r>
-        <w:t>The home position</w:t>
-      </w:r>
-      <w:r>
-        <w:t xml:space="preserve"> for </w:t>
-      </w:r>
-      <w:r>
-        <w:t>equatorial</w:t>
-      </w:r>
-      <w:r>
-        <w:t xml:space="preserve"> mounts</w:t>
-      </w:r>
-      <w:r>
-        <w:t xml:space="preserve"> is defined as </w:t>
-      </w:r>
-      <w:r>
-        <w:t>Dec is</w:t>
-      </w:r>
-      <w:r>
-        <w:t xml:space="preserve"> pointing to the pole and </w:t>
-      </w:r>
-      <w:r>
-        <w:t>R</w:t>
-      </w:r>
-      <w:r>
-        <w:t xml:space="preserve">a with </w:t>
-      </w:r>
-      <w:r>
-        <w:t xml:space="preserve">the </w:t>
-      </w:r>
-      <w:r>
-        <w:t>counterweights</w:t>
-      </w:r>
-      <w:r>
-        <w:t xml:space="preserve"> down.</w:t>
-      </w:r>
-      <w:r>
-        <w:t xml:space="preserve"> </w:t>
-      </w:r>
-      <w:r>
-        <w:t xml:space="preserve">For polar mounts the home position is defined as Az pointing South (North for the southern hemisphere) and the telescope tube 5 degrees above horizontal. </w:t>
-      </w:r>
-      <w:r>
-        <w:t>For Alt/Az mounts the home position is defined as Az pointing to North and the telescope tube horizontal</w:t>
-      </w:r>
-      <w:r>
-        <w:t>.</w:t>
-      </w:r>
-    </w:p>
-    <w:p>
-      <w:r>
-        <w:t>When resyncing with a park position make sure the mount is turned on, connected, and in the desired park position.  If not</w:t>
-      </w:r>
-      <w:r>
-        <w:t xml:space="preserve"> in the correct position</w:t>
-      </w:r>
-      <w:r>
-        <w:t xml:space="preserve">, manually move the mount to the desired position and ReSync with that </w:t>
-      </w:r>
-      <w:r>
-        <w:t xml:space="preserve">park </w:t>
-      </w:r>
-      <w:r>
-        <w:t xml:space="preserve">position.  For encoder accuracy be sure the </w:t>
-      </w:r>
-      <w:r>
-        <w:t xml:space="preserve">manual </w:t>
-      </w:r>
-      <w:r>
-        <w:t>position is as close to the park position as possible.</w:t>
-      </w:r>
-    </w:p>
-    <w:p>
-      <w:bookmarkStart w:id="48" w:name="_Toc62017087"/>
-      <w:r>
-        <w:rPr>
-          <w:rStyle w:val="Heading3Char"/>
-        </w:rPr>
-        <w:t>Flip SOP Button</w:t>
-      </w:r>
-      <w:bookmarkEnd w:id="48"/>
-      <w:r>
-        <w:rPr>
-          <w:rStyle w:val="Heading3Char"/>
-        </w:rPr>
-        <w:t xml:space="preserve"> </w:t>
-      </w:r>
-      <w:r>
-        <w:t xml:space="preserve">– </w:t>
-      </w:r>
-      <w:r>
-        <w:t xml:space="preserve">for equatorial mounts </w:t>
-      </w:r>
-      <w:r>
-        <w:t>moves the mount to the opposite side of the pier</w:t>
-      </w:r>
-      <w:r>
-        <w:t xml:space="preserve"> if allowed by hardware limits</w:t>
-      </w:r>
-      <w:r>
-        <w:t xml:space="preserve">. </w:t>
-      </w:r>
-      <w:r>
-        <w:t>Works in both directions.</w:t>
-      </w:r>
-      <w:r>
-        <w:t xml:space="preserve"> The button text is color accented when flip is allowed.</w:t>
-      </w:r>
-      <w:r>
-        <w:t xml:space="preserve"> </w:t>
-      </w:r>
-      <w:r>
-        <w:t>An “On” badge is active when a flip is in progress.</w:t>
-      </w:r>
-    </w:p>
-    <w:p>
-      <w:bookmarkStart w:id="49" w:name="_Toc62017088"/>
-      <w:r>
-        <w:t xml:space="preserve">For Alt/Az mounts </w:t>
-      </w:r>
-      <w:r>
-        <w:t>moves the mount in the opposite direction to positions around the South azimuth direction</w:t>
-      </w:r>
-      <w:r>
-        <w:t xml:space="preserve"> pier if allowed by hardware limits.</w:t>
-      </w:r>
-      <w:r>
-        <w:t xml:space="preserve"> Works in both directions. </w:t>
-      </w:r>
-      <w:r>
-        <w:rPr>
-          <w:color w:val="FF0000"/>
-        </w:rPr>
-        <w:t>WARNING: The mount will slew 360 degrees through North to reach the new position. Check that cables will not twist or bind.</w:t>
-      </w:r>
-      <w:r>
-        <w:t xml:space="preserve">  </w:t>
-      </w:r>
-    </w:p>
-    <w:p>
-      <w:r>
-        <w:t>For polar mounts moves the mount to the alternative R</w:t>
-      </w:r>
-      <w:r>
-        <w:t>A</w:t>
-      </w:r>
-      <w:r>
-        <w:t>/Dec position if allowed by hardware limits.</w:t>
-      </w:r>
-    </w:p>
-    <w:p>
-      <w:pPr>
-        <w:rPr>
-          <w:color w:val="FF0000"/>
-        </w:rPr>
-      </w:pPr>
-      <w:r>
-        <w:rPr>
-          <w:rStyle w:val="Heading3Char"/>
-        </w:rPr>
-        <w:t>AutoHome Button</w:t>
-      </w:r>
-      <w:bookmarkEnd w:id="49"/>
-      <w:r>
-        <w:rPr>
-          <w:rStyle w:val="Heading3Char"/>
-        </w:rPr>
-        <w:t xml:space="preserve"> </w:t>
-      </w:r>
-      <w:r>
-        <w:t xml:space="preserve">– If your mount is equipped with auto home sensors then this button will assist in recovering the mount </w:t>
-      </w:r>
-      <w:r>
-        <w:t xml:space="preserve">when it </w:t>
-      </w:r>
-      <w:r>
-        <w:t>start</w:t>
-      </w:r>
-      <w:r>
-        <w:t>s</w:t>
-      </w:r>
-      <w:r>
-        <w:t xml:space="preserve"> in a position that is not recognized as a park or home position.  </w:t>
-      </w:r>
-      <w:r>
-        <w:t xml:space="preserve">This would be helpful if the mount loses power and is then powered on and the axis positions are unknown.  </w:t>
+        <w:t xml:space="preserve">powered on and the axis positions are unknown.  </w:t>
       </w:r>
       <w:r>
         <w:t>Auto</w:t>
@@ -6363,11 +6424,7 @@
         <w:t xml:space="preserve">ome will </w:t>
       </w:r>
       <w:r>
-        <w:t xml:space="preserve">attempt to find each axis home sensor.  It does this by moving each axis 5 degrees at a time towards the sensor for a maximum of 100 degrees.  If it did not find the home sensor it will tell you at the end of the process.  Once finished you will have the option to run it again for another 100 degrees </w:t>
-      </w:r>
-      <w:r>
-        <w:lastRenderedPageBreak/>
-        <w:t>search.</w:t>
+        <w:t>attempt to find each axis home sensor.  It does this by moving each axis 5 degrees at a time towards the sensor for a maximum of 100 degrees.  If it did not find the home sensor it will tell you at the end of the process.  Once finished you will have the option to run it again for another 100 degrees search.</w:t>
       </w:r>
       <w:r>
         <w:t xml:space="preserve">  If you’re using a side</w:t>
@@ -6860,6 +6917,7 @@
         <w:rPr>
           <w:color w:val="FF0000"/>
         </w:rPr>
+        <w:lastRenderedPageBreak/>
         <w:t>WARNING - If you slew greater than +180deg from home and loose power, when doing the auto home, instead of slewing in a negative direction to get back it will slew in a Positive direction and possibly twist or bind existing cables.  It’s recommended to monitor the mount a</w:t>
       </w:r>
       <w:r>
@@ -6886,7 +6944,6 @@
         <w:rPr>
           <w:rStyle w:val="Heading3Char"/>
         </w:rPr>
-        <w:lastRenderedPageBreak/>
         <w:t>Scheduler Button</w:t>
       </w:r>
       <w:bookmarkEnd w:id="50"/>
@@ -11623,7 +11680,7 @@
           <w:noProof/>
         </w:rPr>
         <w:drawing>
-          <wp:anchor distT="0" distB="0" distL="114300" distR="114300" simplePos="0" relativeHeight="251710464" behindDoc="0" locked="0" layoutInCell="1" allowOverlap="1" wp14:anchorId="24C3A1FA" wp14:editId="239CD3EF">
+          <wp:anchor distT="0" distB="0" distL="114300" distR="114300" simplePos="0" relativeHeight="251710464" behindDoc="0" locked="0" layoutInCell="1" allowOverlap="1" wp14:anchorId="24C3A1FA" wp14:editId="1B187985">
             <wp:simplePos x="0" y="0"/>
             <wp:positionH relativeFrom="margin">
               <wp:align>right</wp:align>
@@ -15947,7 +16004,7 @@
           <w:lang w:eastAsia="en-GB"/>
         </w:rPr>
         <w:drawing>
-          <wp:inline distT="0" distB="0" distL="0" distR="0" wp14:anchorId="2B301A81" wp14:editId="560BF402">
+          <wp:inline distT="0" distB="0" distL="0" distR="0" wp14:anchorId="2B301A81" wp14:editId="7EC3080B">
             <wp:extent cx="5943600" cy="3566795"/>
             <wp:effectExtent l="0" t="0" r="0" b="0"/>
             <wp:docPr id="680616814" name="Picture 1" descr="A screenshot of a computer&#10;&#10;Description automatically generated"/>
@@ -16331,7 +16388,7 @@
         </w:rPr>
         <w:lastRenderedPageBreak/>
         <w:drawing>
-          <wp:inline distT="0" distB="0" distL="0" distR="0" wp14:anchorId="6C609232" wp14:editId="44DC6498">
+          <wp:inline distT="0" distB="0" distL="0" distR="0" wp14:anchorId="6C609232" wp14:editId="6B4CDCE4">
             <wp:extent cx="5943600" cy="4933315"/>
             <wp:effectExtent l="0" t="0" r="0" b="635"/>
             <wp:docPr id="9779759" name="Picture 1" descr="A screenshot of a computer&#10;&#10;Description automatically generated"/>
@@ -16621,7 +16678,7 @@
           <w:lang w:eastAsia="en-GB"/>
         </w:rPr>
         <w:drawing>
-          <wp:inline distT="0" distB="0" distL="0" distR="0" wp14:anchorId="2AB5C7AB" wp14:editId="4199D064">
+          <wp:inline distT="0" distB="0" distL="0" distR="0" wp14:anchorId="2AB5C7AB" wp14:editId="494B5D73">
             <wp:extent cx="5943600" cy="3562985"/>
             <wp:effectExtent l="0" t="0" r="0" b="0"/>
             <wp:docPr id="471132737" name="Picture 1" descr="A screenshot of a computer&#10;&#10;Description automatically generated"/>
@@ -16777,7 +16834,7 @@
           <w:lang w:eastAsia="en-GB"/>
         </w:rPr>
         <w:drawing>
-          <wp:inline distT="0" distB="0" distL="0" distR="0" wp14:anchorId="0D802248" wp14:editId="15178018">
+          <wp:inline distT="0" distB="0" distL="0" distR="0" wp14:anchorId="0D802248" wp14:editId="49A49094">
             <wp:extent cx="5943600" cy="3562985"/>
             <wp:effectExtent l="0" t="0" r="0" b="0"/>
             <wp:docPr id="1653949960" name="Picture 1" descr="A screenshot of a computer&#10;&#10;Description automatically generated"/>

</xml_diff>

<commit_message>
feature - add Local Sidereal Time to top coordnates bar for Telescope and 3D views, wap LHA and LST with double click, Added language file translations and updatd manual. Bump version to 1.2.2.8 (#139)
</commit_message>
<xml_diff>
--- a/Resources/Manuals/GSS Manual.docx
+++ b/Resources/Manuals/GSS Manual.docx
@@ -5599,6 +5599,9 @@
       <w:r>
         <w:t xml:space="preserve"> the distance of a point east of the First Point of Aries, measured along the celestial equator and expressed in hours, minutes, and seconds.</w:t>
       </w:r>
+      <w:r>
+        <w:t xml:space="preserve"> Double click on the value to swap between hours and degrees display.</w:t>
+      </w:r>
     </w:p>
     <w:p>
       <w:bookmarkStart w:id="30" w:name="_Toc62017068"/>
@@ -5672,6 +5675,57 @@
       <w:r>
         <w:t xml:space="preserve"> – it is the angle between the meridian of the observer and the meridian of the object you are pointing at.  This can be used to tell how far the object is before or after the meridian.</w:t>
       </w:r>
+      <w:r>
+        <w:t xml:space="preserve"> </w:t>
+      </w:r>
+      <w:r>
+        <w:t>Double click on the value to swap between</w:t>
+      </w:r>
+      <w:r>
+        <w:t xml:space="preserve"> Local Hour Angle and Local Sidereal Time</w:t>
+      </w:r>
+      <w:r>
+        <w:t>.</w:t>
+      </w:r>
+      <w:r>
+        <w:t xml:space="preserve"> </w:t>
+      </w:r>
+      <w:r>
+        <w:t xml:space="preserve">Local </w:t>
+      </w:r>
+      <w:r>
+        <w:t>S</w:t>
+      </w:r>
+      <w:r>
+        <w:t xml:space="preserve">idereal </w:t>
+      </w:r>
+      <w:r>
+        <w:t>T</w:t>
+      </w:r>
+      <w:r>
+        <w:t xml:space="preserve">ime </w:t>
+      </w:r>
+      <w:r>
+        <w:t>equals the</w:t>
+      </w:r>
+      <w:r>
+        <w:t xml:space="preserve"> Right Ascension (R.A.) of the celestial coordinate </w:t>
+      </w:r>
+      <w:r>
+        <w:t xml:space="preserve">of an object </w:t>
+      </w:r>
+      <w:r>
+        <w:t xml:space="preserve">that is currently crossing </w:t>
+      </w:r>
+      <w:r>
+        <w:t>the</w:t>
+      </w:r>
+      <w:r>
+        <w:t xml:space="preserve"> local meridian</w:t>
+      </w:r>
+      <w:r>
+        <w:t>.</w:t>
+      </w:r>
     </w:p>
     <w:p>
       <w:bookmarkStart w:id="34" w:name="_Toc62017072"/>
@@ -5751,6 +5805,7 @@
         <w:rPr>
           <w:rStyle w:val="Heading3Char"/>
         </w:rPr>
+        <w:lastRenderedPageBreak/>
         <w:t>Import Button</w:t>
       </w:r>
       <w:bookmarkEnd w:id="38"/>
@@ -5767,7 +5822,6 @@
         <w:rPr>
           <w:rStyle w:val="Heading2Char"/>
         </w:rPr>
-        <w:lastRenderedPageBreak/>
         <w:t xml:space="preserve">Backlash Compensate </w:t>
       </w:r>
     </w:p>
@@ -6045,7 +6099,11 @@
         <w:t xml:space="preserve">. </w:t>
       </w:r>
       <w:r>
-        <w:t xml:space="preserve">For Alt/Az mounts the home position is defined as Az pointing to North and the telescope tube horizontal.  </w:t>
+        <w:t xml:space="preserve">For Alt/Az mounts the home </w:t>
+      </w:r>
+      <w:r>
+        <w:lastRenderedPageBreak/>
+        <w:t xml:space="preserve">position is defined as Az pointing to North and the telescope tube horizontal.  </w:t>
       </w:r>
       <w:r>
         <w:t xml:space="preserve">For polar mounts the home position is defined as Az pointing South (North for the southern hemisphere) and the telescope tube 5 degrees above horizontal. </w:t>
@@ -6075,283 +6133,286 @@
         <w:rPr>
           <w:rStyle w:val="Heading3Char"/>
         </w:rPr>
+        <w:t>Stop Button</w:t>
+      </w:r>
+      <w:bookmarkEnd w:id="46"/>
+      <w:r>
+        <w:t>– Stops mount movement</w:t>
+      </w:r>
+    </w:p>
+    <w:p>
+      <w:bookmarkStart w:id="47" w:name="_Toc62017085"/>
+      <w:r>
+        <w:rPr>
+          <w:rStyle w:val="Heading3Char"/>
+        </w:rPr>
+        <w:t>Tracking</w:t>
+      </w:r>
+      <w:bookmarkEnd w:id="47"/>
+      <w:r>
+        <w:t xml:space="preserve"> </w:t>
+      </w:r>
+      <w:r>
+        <w:rPr>
+          <w:rStyle w:val="Heading3Char"/>
+        </w:rPr>
+        <w:t>Button</w:t>
+      </w:r>
+      <w:r>
+        <w:t xml:space="preserve"> </w:t>
+      </w:r>
+      <w:r>
+        <w:t>–</w:t>
+      </w:r>
+      <w:r>
+        <w:t xml:space="preserve"> turn on or off the selected tracking rate to use.  Will be automatically applied after a slew or goto.</w:t>
+      </w:r>
+      <w:r>
+        <w:t xml:space="preserve"> For Alt/Az mounts tracking will maintain a constant Right Ascension and Declination so that an object of interest remains in the center of the field of view. However, without a field </w:t>
+      </w:r>
+      <w:r>
+        <w:t>de-</w:t>
+      </w:r>
+      <w:r>
+        <w:t>rotator the field of view will appear to rotate about the center point. This rotation may be acceptable for visual observation or short</w:t>
+      </w:r>
+      <w:r>
+        <w:t>er</w:t>
+      </w:r>
+      <w:r>
+        <w:t xml:space="preserve"> exposure imaging but star trails will be visible on long</w:t>
+      </w:r>
+      <w:r>
+        <w:t>er</w:t>
+      </w:r>
+      <w:r>
+        <w:t xml:space="preserve"> exposure imaging.</w:t>
+      </w:r>
+    </w:p>
+    <w:p>
+      <w:r>
+        <w:rPr>
+          <w:rStyle w:val="Heading3Char"/>
+        </w:rPr>
+        <w:t>ReSync</w:t>
+      </w:r>
+      <w:r>
+        <w:t xml:space="preserve">– Resets the </w:t>
+      </w:r>
+      <w:r>
+        <w:t xml:space="preserve">mount </w:t>
+      </w:r>
+      <w:r>
+        <w:t xml:space="preserve">axes </w:t>
+      </w:r>
+      <w:r>
+        <w:t xml:space="preserve">encoder </w:t>
+      </w:r>
+      <w:r>
+        <w:t xml:space="preserve">positions to </w:t>
+      </w:r>
+      <w:r>
+        <w:t>either the</w:t>
+      </w:r>
+      <w:r>
+        <w:t xml:space="preserve"> home position</w:t>
+      </w:r>
+      <w:r>
+        <w:t xml:space="preserve"> or a preset park position.</w:t>
+      </w:r>
+      <w:r>
+        <w:t xml:space="preserve"> </w:t>
+      </w:r>
+      <w:r>
+        <w:t>The home position</w:t>
+      </w:r>
+      <w:r>
+        <w:t xml:space="preserve"> for </w:t>
+      </w:r>
+      <w:r>
+        <w:t>equatorial</w:t>
+      </w:r>
+      <w:r>
+        <w:t xml:space="preserve"> mounts</w:t>
+      </w:r>
+      <w:r>
+        <w:t xml:space="preserve"> is defined as </w:t>
+      </w:r>
+      <w:r>
+        <w:t>Dec is</w:t>
+      </w:r>
+      <w:r>
+        <w:t xml:space="preserve"> pointing to the pole and </w:t>
+      </w:r>
+      <w:r>
+        <w:t>R</w:t>
+      </w:r>
+      <w:r>
+        <w:t xml:space="preserve">a with </w:t>
+      </w:r>
+      <w:r>
+        <w:t xml:space="preserve">the </w:t>
+      </w:r>
+      <w:r>
+        <w:t>counterweights</w:t>
+      </w:r>
+      <w:r>
+        <w:t xml:space="preserve"> down.</w:t>
+      </w:r>
+      <w:r>
+        <w:t xml:space="preserve"> </w:t>
+      </w:r>
+      <w:r>
+        <w:t xml:space="preserve">For polar mounts the home position is defined as Az pointing South (North for the southern hemisphere) and the telescope tube 5 degrees above horizontal. </w:t>
+      </w:r>
+      <w:r>
+        <w:t>For Alt/Az mounts the home position is defined as Az pointing to North and the telescope tube horizontal</w:t>
+      </w:r>
+      <w:r>
+        <w:t>.</w:t>
+      </w:r>
+    </w:p>
+    <w:p>
+      <w:r>
+        <w:t>When resyncing with a park position make sure the mount is turned on, connected, and in the desired park position.  If not</w:t>
+      </w:r>
+      <w:r>
+        <w:t xml:space="preserve"> in the correct position</w:t>
+      </w:r>
+      <w:r>
+        <w:t xml:space="preserve">, manually move the mount to the desired position and ReSync with that </w:t>
+      </w:r>
+      <w:r>
+        <w:t xml:space="preserve">park </w:t>
+      </w:r>
+      <w:r>
+        <w:t xml:space="preserve">position.  For encoder accuracy be sure the </w:t>
+      </w:r>
+      <w:r>
+        <w:t xml:space="preserve">manual </w:t>
+      </w:r>
+      <w:r>
+        <w:t>position is as close to the park position as possible.</w:t>
+      </w:r>
+    </w:p>
+    <w:p>
+      <w:bookmarkStart w:id="48" w:name="_Toc62017087"/>
+      <w:r>
+        <w:rPr>
+          <w:rStyle w:val="Heading3Char"/>
+        </w:rPr>
+        <w:t>Flip SOP Button</w:t>
+      </w:r>
+      <w:bookmarkEnd w:id="48"/>
+      <w:r>
+        <w:rPr>
+          <w:rStyle w:val="Heading3Char"/>
+        </w:rPr>
+        <w:t xml:space="preserve"> </w:t>
+      </w:r>
+      <w:r>
+        <w:t xml:space="preserve">– </w:t>
+      </w:r>
+      <w:r>
+        <w:t xml:space="preserve">for equatorial mounts </w:t>
+      </w:r>
+      <w:r>
+        <w:t>moves the mount to the opposite side of the pier</w:t>
+      </w:r>
+      <w:r>
+        <w:t xml:space="preserve"> if allowed by hardware limits</w:t>
+      </w:r>
+      <w:r>
+        <w:t xml:space="preserve">. </w:t>
+      </w:r>
+      <w:r>
+        <w:t>Works in both directions.</w:t>
+      </w:r>
+      <w:r>
+        <w:t xml:space="preserve"> The button text is color accented when flip is allowed.</w:t>
+      </w:r>
+      <w:r>
+        <w:t xml:space="preserve"> </w:t>
+      </w:r>
+      <w:r>
+        <w:t>An “On” badge is active when a flip is in progress.</w:t>
+      </w:r>
+    </w:p>
+    <w:p>
+      <w:bookmarkStart w:id="49" w:name="_Toc62017088"/>
+      <w:r>
+        <w:t xml:space="preserve">For Alt/Az mounts </w:t>
+      </w:r>
+      <w:r>
+        <w:t>moves the mount in the opposite direction to positions around the South azimuth direction</w:t>
+      </w:r>
+      <w:r>
+        <w:t xml:space="preserve"> pier if allowed by hardware limits.</w:t>
+      </w:r>
+      <w:r>
+        <w:t xml:space="preserve"> Works in both directions. </w:t>
+      </w:r>
+      <w:r>
+        <w:rPr>
+          <w:color w:val="FF0000"/>
+        </w:rPr>
+        <w:t>WARNING: The mount will slew 360 degrees through North to reach the new position. Check that cables will not twist or bind.</w:t>
+      </w:r>
+      <w:r>
+        <w:t xml:space="preserve">  </w:t>
+      </w:r>
+    </w:p>
+    <w:p>
+      <w:r>
+        <w:t>For polar mounts moves the mount to the alternative R</w:t>
+      </w:r>
+      <w:r>
+        <w:t>A</w:t>
+      </w:r>
+      <w:r>
+        <w:t>/Dec position if allowed by hardware limits.</w:t>
+      </w:r>
+    </w:p>
+    <w:p>
+      <w:pPr>
+        <w:rPr>
+          <w:color w:val="FF0000"/>
+        </w:rPr>
+      </w:pPr>
+      <w:r>
+        <w:rPr>
+          <w:rStyle w:val="Heading3Char"/>
+        </w:rPr>
+        <w:t>AutoHome Button</w:t>
+      </w:r>
+      <w:bookmarkEnd w:id="49"/>
+      <w:r>
+        <w:rPr>
+          <w:rStyle w:val="Heading3Char"/>
+        </w:rPr>
+        <w:t xml:space="preserve"> </w:t>
+      </w:r>
+      <w:r>
+        <w:t xml:space="preserve">– If your mount is equipped with auto home sensors then this button will assist in recovering the mount </w:t>
+      </w:r>
+      <w:r>
+        <w:t xml:space="preserve">when it </w:t>
+      </w:r>
+      <w:r>
+        <w:t>start</w:t>
+      </w:r>
+      <w:r>
+        <w:t>s</w:t>
+      </w:r>
+      <w:r>
+        <w:t xml:space="preserve"> in a position that is not recognized as a park or home position.  </w:t>
+      </w:r>
+      <w:r>
+        <w:t xml:space="preserve">This would be helpful if the mount loses power and is then </w:t>
+      </w:r>
+      <w:r>
         <w:lastRenderedPageBreak/>
-        <w:t>Stop Button</w:t>
-      </w:r>
-      <w:bookmarkEnd w:id="46"/>
-      <w:r>
-        <w:t>– Stops mount movement</w:t>
-      </w:r>
-    </w:p>
-    <w:p>
-      <w:bookmarkStart w:id="47" w:name="_Toc62017085"/>
-      <w:r>
-        <w:rPr>
-          <w:rStyle w:val="Heading3Char"/>
-        </w:rPr>
-        <w:t>Tracking</w:t>
-      </w:r>
-      <w:bookmarkEnd w:id="47"/>
-      <w:r>
-        <w:t xml:space="preserve"> </w:t>
-      </w:r>
-      <w:r>
-        <w:rPr>
-          <w:rStyle w:val="Heading3Char"/>
-        </w:rPr>
-        <w:t>Button</w:t>
-      </w:r>
-      <w:r>
-        <w:t xml:space="preserve"> </w:t>
-      </w:r>
-      <w:r>
-        <w:t>–</w:t>
-      </w:r>
-      <w:r>
-        <w:t xml:space="preserve"> turn on or off the selected tracking rate to use.  Will be automatically applied after a slew or goto.</w:t>
-      </w:r>
-      <w:r>
-        <w:t xml:space="preserve"> For Alt/Az mounts tracking will maintain a constant Right Ascension and Declination so that an object of interest remains in the center of the field of view. However, without a field </w:t>
-      </w:r>
-      <w:r>
-        <w:t>de-</w:t>
-      </w:r>
-      <w:r>
-        <w:t>rotator the field of view will appear to rotate about the center point. This rotation may be acceptable for visual observation or short</w:t>
-      </w:r>
-      <w:r>
-        <w:t>er</w:t>
-      </w:r>
-      <w:r>
-        <w:t xml:space="preserve"> exposure imaging but star trails will be visible on long</w:t>
-      </w:r>
-      <w:r>
-        <w:t>er</w:t>
-      </w:r>
-      <w:r>
-        <w:t xml:space="preserve"> exposure imaging.</w:t>
-      </w:r>
-    </w:p>
-    <w:p>
-      <w:r>
-        <w:rPr>
-          <w:rStyle w:val="Heading3Char"/>
-        </w:rPr>
-        <w:t>ReSync</w:t>
-      </w:r>
-      <w:r>
-        <w:t xml:space="preserve">– Resets the </w:t>
-      </w:r>
-      <w:r>
-        <w:t xml:space="preserve">mount </w:t>
-      </w:r>
-      <w:r>
-        <w:t xml:space="preserve">axes </w:t>
-      </w:r>
-      <w:r>
-        <w:t xml:space="preserve">encoder </w:t>
-      </w:r>
-      <w:r>
-        <w:t xml:space="preserve">positions to </w:t>
-      </w:r>
-      <w:r>
-        <w:t>either the</w:t>
-      </w:r>
-      <w:r>
-        <w:t xml:space="preserve"> home position</w:t>
-      </w:r>
-      <w:r>
-        <w:t xml:space="preserve"> or a preset park position.</w:t>
-      </w:r>
-      <w:r>
-        <w:t xml:space="preserve"> </w:t>
-      </w:r>
-      <w:r>
-        <w:t>The home position</w:t>
-      </w:r>
-      <w:r>
-        <w:t xml:space="preserve"> for </w:t>
-      </w:r>
-      <w:r>
-        <w:t>equatorial</w:t>
-      </w:r>
-      <w:r>
-        <w:t xml:space="preserve"> mounts</w:t>
-      </w:r>
-      <w:r>
-        <w:t xml:space="preserve"> is defined as </w:t>
-      </w:r>
-      <w:r>
-        <w:t>Dec is</w:t>
-      </w:r>
-      <w:r>
-        <w:t xml:space="preserve"> pointing to the pole and </w:t>
-      </w:r>
-      <w:r>
-        <w:t>R</w:t>
-      </w:r>
-      <w:r>
-        <w:t xml:space="preserve">a with </w:t>
-      </w:r>
-      <w:r>
-        <w:t xml:space="preserve">the </w:t>
-      </w:r>
-      <w:r>
-        <w:t>counterweights</w:t>
-      </w:r>
-      <w:r>
-        <w:t xml:space="preserve"> down.</w:t>
-      </w:r>
-      <w:r>
-        <w:t xml:space="preserve"> </w:t>
-      </w:r>
-      <w:r>
-        <w:t xml:space="preserve">For polar mounts the home position is defined as Az pointing South (North for the southern hemisphere) and the telescope tube 5 degrees above horizontal. </w:t>
-      </w:r>
-      <w:r>
-        <w:t>For Alt/Az mounts the home position is defined as Az pointing to North and the telescope tube horizontal</w:t>
-      </w:r>
-      <w:r>
-        <w:t>.</w:t>
-      </w:r>
-    </w:p>
-    <w:p>
-      <w:r>
-        <w:t>When resyncing with a park position make sure the mount is turned on, connected, and in the desired park position.  If not</w:t>
-      </w:r>
-      <w:r>
-        <w:t xml:space="preserve"> in the correct position</w:t>
-      </w:r>
-      <w:r>
-        <w:t xml:space="preserve">, manually move the mount to the desired position and ReSync with that </w:t>
-      </w:r>
-      <w:r>
-        <w:t xml:space="preserve">park </w:t>
-      </w:r>
-      <w:r>
-        <w:t xml:space="preserve">position.  For encoder accuracy be sure the </w:t>
-      </w:r>
-      <w:r>
-        <w:t xml:space="preserve">manual </w:t>
-      </w:r>
-      <w:r>
-        <w:t>position is as close to the park position as possible.</w:t>
-      </w:r>
-    </w:p>
-    <w:p>
-      <w:bookmarkStart w:id="48" w:name="_Toc62017087"/>
-      <w:r>
-        <w:rPr>
-          <w:rStyle w:val="Heading3Char"/>
-        </w:rPr>
-        <w:t>Flip SOP Button</w:t>
-      </w:r>
-      <w:bookmarkEnd w:id="48"/>
-      <w:r>
-        <w:rPr>
-          <w:rStyle w:val="Heading3Char"/>
-        </w:rPr>
-        <w:t xml:space="preserve"> </w:t>
-      </w:r>
-      <w:r>
-        <w:t xml:space="preserve">– </w:t>
-      </w:r>
-      <w:r>
-        <w:t xml:space="preserve">for equatorial mounts </w:t>
-      </w:r>
-      <w:r>
-        <w:t>moves the mount to the opposite side of the pier</w:t>
-      </w:r>
-      <w:r>
-        <w:t xml:space="preserve"> if allowed by hardware limits</w:t>
-      </w:r>
-      <w:r>
-        <w:t xml:space="preserve">. </w:t>
-      </w:r>
-      <w:r>
-        <w:t>Works in both directions.</w:t>
-      </w:r>
-      <w:r>
-        <w:t xml:space="preserve"> The button text is color accented when flip is allowed.</w:t>
-      </w:r>
-      <w:r>
-        <w:t xml:space="preserve"> </w:t>
-      </w:r>
-      <w:r>
-        <w:t>An “On” badge is active when a flip is in progress.</w:t>
-      </w:r>
-    </w:p>
-    <w:p>
-      <w:bookmarkStart w:id="49" w:name="_Toc62017088"/>
-      <w:r>
-        <w:t xml:space="preserve">For Alt/Az mounts </w:t>
-      </w:r>
-      <w:r>
-        <w:t>moves the mount in the opposite direction to positions around the South azimuth direction</w:t>
-      </w:r>
-      <w:r>
-        <w:t xml:space="preserve"> pier if allowed by hardware limits.</w:t>
-      </w:r>
-      <w:r>
-        <w:t xml:space="preserve"> Works in both directions. </w:t>
-      </w:r>
-      <w:r>
-        <w:rPr>
-          <w:color w:val="FF0000"/>
-        </w:rPr>
-        <w:t>WARNING: The mount will slew 360 degrees through North to reach the new position. Check that cables will not twist or bind.</w:t>
-      </w:r>
-      <w:r>
-        <w:t xml:space="preserve">  </w:t>
-      </w:r>
-    </w:p>
-    <w:p>
-      <w:r>
-        <w:t>For polar mounts moves the mount to the alternative R</w:t>
-      </w:r>
-      <w:r>
-        <w:t>A</w:t>
-      </w:r>
-      <w:r>
-        <w:t>/Dec position if allowed by hardware limits.</w:t>
-      </w:r>
-    </w:p>
-    <w:p>
-      <w:pPr>
-        <w:rPr>
-          <w:color w:val="FF0000"/>
-        </w:rPr>
-      </w:pPr>
-      <w:r>
-        <w:rPr>
-          <w:rStyle w:val="Heading3Char"/>
-        </w:rPr>
-        <w:t>AutoHome Button</w:t>
-      </w:r>
-      <w:bookmarkEnd w:id="49"/>
-      <w:r>
-        <w:rPr>
-          <w:rStyle w:val="Heading3Char"/>
-        </w:rPr>
-        <w:t xml:space="preserve"> </w:t>
-      </w:r>
-      <w:r>
-        <w:t xml:space="preserve">– If your mount is equipped with auto home sensors then this button will assist in recovering the mount </w:t>
-      </w:r>
-      <w:r>
-        <w:t xml:space="preserve">when it </w:t>
-      </w:r>
-      <w:r>
-        <w:t>start</w:t>
-      </w:r>
-      <w:r>
-        <w:t>s</w:t>
-      </w:r>
-      <w:r>
-        <w:t xml:space="preserve"> in a position that is not recognized as a park or home position.  </w:t>
-      </w:r>
-      <w:r>
-        <w:t xml:space="preserve">This would be helpful if the mount loses power and is then powered on and the axis positions are unknown.  </w:t>
+        <w:t xml:space="preserve">powered on and the axis positions are unknown.  </w:t>
       </w:r>
       <w:r>
         <w:t>Auto</w:t>
@@ -6363,11 +6424,7 @@
         <w:t xml:space="preserve">ome will </w:t>
       </w:r>
       <w:r>
-        <w:t xml:space="preserve">attempt to find each axis home sensor.  It does this by moving each axis 5 degrees at a time towards the sensor for a maximum of 100 degrees.  If it did not find the home sensor it will tell you at the end of the process.  Once finished you will have the option to run it again for another 100 degrees </w:t>
-      </w:r>
-      <w:r>
-        <w:lastRenderedPageBreak/>
-        <w:t>search.</w:t>
+        <w:t>attempt to find each axis home sensor.  It does this by moving each axis 5 degrees at a time towards the sensor for a maximum of 100 degrees.  If it did not find the home sensor it will tell you at the end of the process.  Once finished you will have the option to run it again for another 100 degrees search.</w:t>
       </w:r>
       <w:r>
         <w:t xml:space="preserve">  If you’re using a side</w:t>
@@ -6860,6 +6917,7 @@
         <w:rPr>
           <w:color w:val="FF0000"/>
         </w:rPr>
+        <w:lastRenderedPageBreak/>
         <w:t>WARNING - If you slew greater than +180deg from home and loose power, when doing the auto home, instead of slewing in a negative direction to get back it will slew in a Positive direction and possibly twist or bind existing cables.  It’s recommended to monitor the mount a</w:t>
       </w:r>
       <w:r>
@@ -6886,7 +6944,6 @@
         <w:rPr>
           <w:rStyle w:val="Heading3Char"/>
         </w:rPr>
-        <w:lastRenderedPageBreak/>
         <w:t>Scheduler Button</w:t>
       </w:r>
       <w:bookmarkEnd w:id="50"/>
@@ -11623,7 +11680,7 @@
           <w:noProof/>
         </w:rPr>
         <w:drawing>
-          <wp:anchor distT="0" distB="0" distL="114300" distR="114300" simplePos="0" relativeHeight="251710464" behindDoc="0" locked="0" layoutInCell="1" allowOverlap="1" wp14:anchorId="24C3A1FA" wp14:editId="239CD3EF">
+          <wp:anchor distT="0" distB="0" distL="114300" distR="114300" simplePos="0" relativeHeight="251710464" behindDoc="0" locked="0" layoutInCell="1" allowOverlap="1" wp14:anchorId="24C3A1FA" wp14:editId="1B187985">
             <wp:simplePos x="0" y="0"/>
             <wp:positionH relativeFrom="margin">
               <wp:align>right</wp:align>
@@ -15947,7 +16004,7 @@
           <w:lang w:eastAsia="en-GB"/>
         </w:rPr>
         <w:drawing>
-          <wp:inline distT="0" distB="0" distL="0" distR="0" wp14:anchorId="2B301A81" wp14:editId="560BF402">
+          <wp:inline distT="0" distB="0" distL="0" distR="0" wp14:anchorId="2B301A81" wp14:editId="7EC3080B">
             <wp:extent cx="5943600" cy="3566795"/>
             <wp:effectExtent l="0" t="0" r="0" b="0"/>
             <wp:docPr id="680616814" name="Picture 1" descr="A screenshot of a computer&#10;&#10;Description automatically generated"/>
@@ -16331,7 +16388,7 @@
         </w:rPr>
         <w:lastRenderedPageBreak/>
         <w:drawing>
-          <wp:inline distT="0" distB="0" distL="0" distR="0" wp14:anchorId="6C609232" wp14:editId="44DC6498">
+          <wp:inline distT="0" distB="0" distL="0" distR="0" wp14:anchorId="6C609232" wp14:editId="6B4CDCE4">
             <wp:extent cx="5943600" cy="4933315"/>
             <wp:effectExtent l="0" t="0" r="0" b="635"/>
             <wp:docPr id="9779759" name="Picture 1" descr="A screenshot of a computer&#10;&#10;Description automatically generated"/>
@@ -16621,7 +16678,7 @@
           <w:lang w:eastAsia="en-GB"/>
         </w:rPr>
         <w:drawing>
-          <wp:inline distT="0" distB="0" distL="0" distR="0" wp14:anchorId="2AB5C7AB" wp14:editId="4199D064">
+          <wp:inline distT="0" distB="0" distL="0" distR="0" wp14:anchorId="2AB5C7AB" wp14:editId="494B5D73">
             <wp:extent cx="5943600" cy="3562985"/>
             <wp:effectExtent l="0" t="0" r="0" b="0"/>
             <wp:docPr id="471132737" name="Picture 1" descr="A screenshot of a computer&#10;&#10;Description automatically generated"/>
@@ -16777,7 +16834,7 @@
           <w:lang w:eastAsia="en-GB"/>
         </w:rPr>
         <w:drawing>
-          <wp:inline distT="0" distB="0" distL="0" distR="0" wp14:anchorId="0D802248" wp14:editId="15178018">
+          <wp:inline distT="0" distB="0" distL="0" distR="0" wp14:anchorId="0D802248" wp14:editId="49A49094">
             <wp:extent cx="5943600" cy="3562985"/>
             <wp:effectExtent l="0" t="0" r="0" b="0"/>
             <wp:docPr id="1653949960" name="Picture 1" descr="A screenshot of a computer&#10;&#10;Description automatically generated"/>

</xml_diff>